<commit_message>
Update source code 20260705
</commit_message>
<xml_diff>
--- a/documents/EduManage_Tai_Lieu_Thuyet_Trinh_v3.docx
+++ b/documents/EduManage_Tai_Lieu_Thuyet_Trinh_v3.docx
@@ -1609,7 +1609,7 @@
           <w:i w:val="0"/>
           <w:sz w:val="26"/>
         </w:rPr>
-        <w:t>EduManage là hệ thống quản lý đào tạo đại học dạng website, được xây dựng nhằm số hóa các nghiệp vụ cốt lõi của một trường đại học: quản lý tài khoản sinh viên và giảng viên, quản lý danh mục đào tạo (Khoa, Ngành, Lớp, Môn học, Lớp học phần, Học kỳ), đăng ký học phần, điểm danh, nhập điểm, tính điểm trung bình tích lũy (GPA) và thống kê tổng quan theo từng vai trò.</w:t>
+        <w:t xml:space="preserve">EduManage là hệ thống quản lý đào tạo đại học dạng website, được xây dựng nhằm số hóa các nghiệp vụ cốt lõi của một trường đại học: quản lý tài khoản sinh viên và giảng viên, quản lý danh mục đào tạo (Khoa, Ngành, Lớp, Môn học, Lớp học phần, Học kỳ), lịch học trong tuần của lớp học phần, đăng ký học phần có kiểm soát trùng lịch, điểm danh, nhập điểm, tính điểm trung bình tích lũy (GPA) và thống kê tổng quan theo từng vai trò.</w:t>
       </w:r>
     </w:p>
     <w:p>
@@ -1907,7 +1907,7 @@
           <w:i w:val="0"/>
           <w:sz w:val="26"/>
         </w:rPr>
-        <w:t>Hệ thống EduManage bao phủ các nghiệp vụ: quản lý tài khoản (tạo đơn lẻ, nhập hàng loạt từ CSV/Excel, khóa/mở khóa, xóa), quản lý danh mục đào tạo theo phân cấp Khoa → Ngành → Lớp / Môn học, quản lý lớp học phần và học kỳ, đăng ký / hủy đăng ký học phần, điểm danh theo buổi, nhập điểm và khóa điểm, bảng điểm và GPA, thống kê tổng quan theo vai trò, xuất danh sách ra CSV/Excel.</w:t>
+        <w:t xml:space="preserve">Hệ thống EduManage bao phủ các nghiệp vụ: quản lý tài khoản (tạo đơn lẻ, nhập hàng loạt từ CSV/Excel, khóa/mở khóa, xóa), quản lý danh mục đào tạo theo phân cấp Khoa → Ngành → Lớp / Môn học, quản lý lớp học phần và học kỳ kèm lịch học trong tuần (ngày học, khung giờ, kiểm tra trùng lịch dạy của giảng viên), đăng ký / hủy đăng ký học phần có chặn trùng lịch học, điểm danh theo buổi, nhập điểm và khóa điểm, bảng điểm và GPA, thống kê tổng quan theo vai trò, xuất danh sách ra CSV/Excel.</w:t>
       </w:r>
     </w:p>
     <w:p>
@@ -3260,7 +3260,7 @@
                 <w:i w:val="0"/>
                 <w:sz w:val="22"/>
               </w:rPr>
-              <w:t>Mở lớp học phần theo Môn học + Giảng viên + Học kỳ; danh sách lớp theo vai trò</w:t>
+              <w:t xml:space="preserve">Mở lớp học phần theo Môn học + Giảng viên + Học kỳ kèm lịch học trong tuần (ngày học, giờ bắt đầu – kết thúc); kiểm tra trùng lịch dạy của giảng viên; danh sách lớp theo vai trò</w:t>
             </w:r>
           </w:p>
         </w:tc>
@@ -3300,7 +3300,7 @@
                 <w:i w:val="0"/>
                 <w:sz w:val="22"/>
               </w:rPr>
-              <w:t>Đăng ký / hủy đăng ký, nhập điểm, khóa điểm, bảng điểm, GPA</w:t>
+              <w:t xml:space="preserve">Đăng ký / hủy đăng ký (chặn đăng ký lớp trùng lịch học), nhập điểm, khóa điểm, bảng điểm, GPA</w:t>
             </w:r>
           </w:p>
         </w:tc>
@@ -4945,11 +4945,11 @@
       <w:r>
         <w:rPr>
           <w:rFonts w:ascii="Times New Roman" w:hAnsi="Times New Roman" w:cs="Times New Roman"/>
-          <w:b/>
+          <w:b w:val="1"/>
           <w:i w:val="0"/>
           <w:sz w:val="26"/>
         </w:rPr>
-        <w:t>Quản lý lớp học phần</w:t>
+        <w:t xml:space="preserve">Quản lý lớp học phần</w:t>
       </w:r>
       <w:r>
         <w:rPr>
@@ -4958,7 +4958,25 @@
           <w:i w:val="0"/>
           <w:sz w:val="26"/>
         </w:rPr>
-        <w:t>: mở lớp học phần gắn với Môn học, Giảng viên phụ trách, tên học kỳ, sĩ số tối đa và trạng thái.</w:t>
+        <w:t xml:space="preserve">: mở lớp học phần gắn với Môn học, Giảng viên phụ trách, tên học kỳ, sĩ số tối đa, trạng thái và </w:t>
+      </w:r>
+      <w:r>
+        <w:rPr>
+          <w:rFonts w:ascii="Times New Roman" w:hAnsi="Times New Roman" w:cs="Times New Roman"/>
+          <w:b w:val="1"/>
+          <w:i w:val="0"/>
+          <w:sz w:val="26"/>
+        </w:rPr>
+        <w:t xml:space="preserve">lịch học trong tuần</w:t>
+      </w:r>
+      <w:r>
+        <w:rPr>
+          <w:rFonts w:ascii="Times New Roman" w:hAnsi="Times New Roman" w:cs="Times New Roman"/>
+          <w:b w:val="0"/>
+          <w:i w:val="0"/>
+          <w:sz w:val="26"/>
+        </w:rPr>
+        <w:t xml:space="preserve"> (chọn các ngày học Thứ 2 → Chủ nhật, giờ bắt đầu và giờ kết thúc). Khi phân công, hệ thống kiểm tra giảng viên có trống lịch trong khung giờ đó không: nếu trùng với một lớp khác cùng học kỳ, hệ thống từ chối và báo rõ lớp bị trùng để Admin chọn giảng viên khác hoặc đổi lịch.</w:t>
       </w:r>
     </w:p>
     <w:p>
@@ -5226,11 +5244,11 @@
       <w:r>
         <w:rPr>
           <w:rFonts w:ascii="Times New Roman" w:hAnsi="Times New Roman" w:cs="Times New Roman"/>
-          <w:b/>
+          <w:b w:val="1"/>
           <w:i w:val="0"/>
           <w:sz w:val="26"/>
         </w:rPr>
-        <w:t>Xem lịch dạy</w:t>
+        <w:t xml:space="preserve">Xem lịch dạy</w:t>
       </w:r>
       <w:r>
         <w:rPr>
@@ -5239,16 +5257,31 @@
           <w:i w:val="0"/>
           <w:sz w:val="26"/>
         </w:rPr>
-        <w:t xml:space="preserve"> và </w:t>
+        <w:t xml:space="preserve">: mỗi lớp phụ trách hiển thị rõ dạy vào những thứ nào trong tuần và khung giờ nào (ví dụ "Thứ 2, Thứ 4 · 07:00–09:30") — trên Dashboard, màn hình "Lớp của tôi" và màn hình "Lịch dạy".</w:t>
+      </w:r>
+    </w:p>
+    <w:p>
+      <w:pPr>
+        <w:spacing w:after="80" w:before="0" w:line="300" w:lineRule="auto"/>
+        <w:ind w:left="425" w:hanging="198"/>
+      </w:pPr>
+      <w:r>
+        <w:rPr>
+          <w:rFonts w:ascii="Times New Roman" w:hAnsi="Times New Roman" w:cs="Times New Roman"/>
+          <w:b w:val="0"/>
+          <w:i w:val="0"/>
+          <w:sz w:val="26"/>
+        </w:rPr>
+        <w:t xml:space="preserve">•  </w:t>
       </w:r>
       <w:r>
         <w:rPr>
           <w:rFonts w:ascii="Times New Roman" w:hAnsi="Times New Roman" w:cs="Times New Roman"/>
-          <w:b/>
+          <w:b w:val="1"/>
           <w:i w:val="0"/>
           <w:sz w:val="26"/>
         </w:rPr>
-        <w:t>thống kê riêng</w:t>
+        <w:t xml:space="preserve">Thống kê riêng</w:t>
       </w:r>
       <w:r>
         <w:rPr>
@@ -5257,7 +5290,7 @@
           <w:i w:val="0"/>
           <w:sz w:val="26"/>
         </w:rPr>
-        <w:t>: số lớp phụ trách, tổng sinh viên, tỷ lệ điểm danh, số bài chưa chấm, xu hướng điểm danh các buổi gần nhất.</w:t>
+        <w:t xml:space="preserve">: số lớp phụ trách, tổng sinh viên, tỷ lệ điểm danh, số bài chưa chấm, xu hướng điểm danh các buổi gần nhất.</w:t>
       </w:r>
     </w:p>
     <w:p>
@@ -5294,11 +5327,11 @@
       <w:r>
         <w:rPr>
           <w:rFonts w:ascii="Times New Roman" w:hAnsi="Times New Roman" w:cs="Times New Roman"/>
-          <w:b/>
+          <w:b w:val="1"/>
           <w:i w:val="0"/>
           <w:sz w:val="26"/>
         </w:rPr>
-        <w:t>Đăng ký học phần</w:t>
+        <w:t xml:space="preserve">Đăng ký học phần</w:t>
       </w:r>
       <w:r>
         <w:rPr>
@@ -5307,7 +5340,25 @@
           <w:i w:val="0"/>
           <w:sz w:val="26"/>
         </w:rPr>
-        <w:t>: xem các lớp học phần đang mở trong học kỳ hoạt động và đăng ký; hệ thống kiểm tra sĩ số và chặn đăng ký trùng.</w:t>
+        <w:t xml:space="preserve">: xem các lớp học phần đang mở trong học kỳ hoạt động (kèm lịch học từng lớp) và đăng ký; hệ thống kiểm tra sĩ số, chặn đăng ký trùng và </w:t>
+      </w:r>
+      <w:r>
+        <w:rPr>
+          <w:rFonts w:ascii="Times New Roman" w:hAnsi="Times New Roman" w:cs="Times New Roman"/>
+          <w:b w:val="1"/>
+          <w:i w:val="0"/>
+          <w:sz w:val="26"/>
+        </w:rPr>
+        <w:t xml:space="preserve">chặn đăng ký lớp trùng lịch học</w:t>
+      </w:r>
+      <w:r>
+        <w:rPr>
+          <w:rFonts w:ascii="Times New Roman" w:hAnsi="Times New Roman" w:cs="Times New Roman"/>
+          <w:b w:val="0"/>
+          <w:i w:val="0"/>
+          <w:sz w:val="26"/>
+        </w:rPr>
+        <w:t xml:space="preserve"> với môn đã đăng ký trước đó (trùng ngày trong tuần và giao nhau về khung giờ) — giao diện cảnh báo sớm bằng nhãn "Trùng lịch", server từ chối và báo rõ lớp bị trùng.</w:t>
       </w:r>
     </w:p>
     <w:p>
@@ -5360,11 +5411,11 @@
       <w:r>
         <w:rPr>
           <w:rFonts w:ascii="Times New Roman" w:hAnsi="Times New Roman" w:cs="Times New Roman"/>
-          <w:b/>
+          <w:b w:val="1"/>
           <w:i w:val="0"/>
           <w:sz w:val="26"/>
         </w:rPr>
-        <w:t>Xem lịch học</w:t>
+        <w:t xml:space="preserve">Xem lịch học</w:t>
       </w:r>
       <w:r>
         <w:rPr>
@@ -5373,7 +5424,7 @@
           <w:i w:val="0"/>
           <w:sz w:val="26"/>
         </w:rPr>
-        <w:t>: danh sách môn đã đăng ký, nhóm theo học kỳ.</w:t>
+        <w:t xml:space="preserve">: danh sách môn đã đăng ký, nhóm theo học kỳ, mỗi môn hiển thị rõ học vào những thứ nào trong tuần và từ giờ nào đến giờ nào.</w:t>
       </w:r>
     </w:p>
     <w:p>
@@ -13569,7 +13620,7 @@
                 <w:i w:val="0"/>
                 <w:sz w:val="22"/>
               </w:rPr>
-              <w:t>Admin mở lớp học phần (gắn Môn học + Giảng viên + tên học kỳ) và quản lý danh sách Học kỳ, đánh dấu học kỳ đang hoạt động.</w:t>
+              <w:t xml:space="preserve">Admin mở lớp học phần (gắn Môn học + Giảng viên + tên học kỳ + lịch học trong tuần) và quản lý danh sách Học kỳ, đánh dấu học kỳ đang hoạt động.</w:t>
             </w:r>
           </w:p>
         </w:tc>
@@ -13674,7 +13725,7 @@
                 <w:i w:val="0"/>
                 <w:sz w:val="22"/>
               </w:rPr>
-              <w:t>Lớp học phần sẵn sàng cho sinh viên đăng ký khi ở trạng thái hoạt động và thuộc học kỳ đang hoạt động.</w:t>
+              <w:t xml:space="preserve">Lớp học phần có lịch học rõ ràng (ngày trong tuần + khung giờ), giảng viên phụ trách không bị trùng lịch dạy, sẵn sàng cho sinh viên đăng ký khi ở trạng thái hoạt động và thuộc học kỳ đang hoạt động.</w:t>
             </w:r>
           </w:p>
         </w:tc>
@@ -13758,7 +13809,34 @@
                 <w:i w:val="0"/>
                 <w:sz w:val="22"/>
               </w:rPr>
-              <w:t>2. Màn hình "Lớp học phần": Admin tạo lớp mới — chọn Môn học, Giảng viên phụ trách, nhập tên học kỳ, sĩ số tối đa và trạng thái.</w:t>
+              <w:t xml:space="preserve">2. </w:t>
+            </w:r>
+            <w:r>
+              <w:rPr>
+                <w:rFonts w:ascii="Times New Roman" w:hAnsi="Times New Roman" w:cs="Times New Roman"/>
+                <w:b w:val="0"/>
+                <w:i w:val="0"/>
+                <w:sz w:val="22"/>
+              </w:rPr>
+              <w:t xml:space="preserve">Màn hình "Lớp học phần": Admin tạo lớp mới — chọn Môn học, Giảng viên phụ trách, nhập tên học kỳ, sĩ số tối đa, trạng thái và </w:t>
+            </w:r>
+            <w:r>
+              <w:rPr>
+                <w:rFonts w:ascii="Times New Roman" w:hAnsi="Times New Roman" w:cs="Times New Roman"/>
+                <w:b w:val="1"/>
+                <w:i w:val="0"/>
+                <w:sz w:val="22"/>
+              </w:rPr>
+              <w:t xml:space="preserve">lịch học trong tuần</w:t>
+            </w:r>
+            <w:r>
+              <w:rPr>
+                <w:rFonts w:ascii="Times New Roman" w:hAnsi="Times New Roman" w:cs="Times New Roman"/>
+                <w:b w:val="0"/>
+                <w:i w:val="0"/>
+                <w:sz w:val="22"/>
+              </w:rPr>
+              <w:t xml:space="preserve">: chọn một hoặc nhiều ngày học (Thứ 2 → Chủ nhật, ví dụ dạy Thứ 3 – Thứ 5 – Thứ 6, tức 2–3 buổi mỗi tuần), giờ bắt đầu và giờ kết thúc.</w:t>
             </w:r>
           </w:p>
           <w:p>
@@ -13773,7 +13851,124 @@
                 <w:i w:val="0"/>
                 <w:sz w:val="22"/>
               </w:rPr>
-              <w:t>3. Các chức năng khác (đăng ký học phần, thống kê) tự lọc theo các lớp học phần có tên học kỳ khớp với học kỳ đang hoạt động.</w:t>
+              <w:t xml:space="preserve">3. </w:t>
+            </w:r>
+            <w:r>
+              <w:rPr>
+                <w:rFonts w:ascii="Times New Roman" w:hAnsi="Times New Roman" w:cs="Times New Roman"/>
+                <w:b w:val="0"/>
+                <w:i w:val="0"/>
+                <w:sz w:val="22"/>
+              </w:rPr>
+              <w:t xml:space="preserve">Hệ thống kiểm tra lịch học hợp lệ: đã chọn ít nhất một ngày, giờ đúng định dạng, giờ bắt đầu phải trước giờ kết thúc (sai → Luồng B).</w:t>
+            </w:r>
+          </w:p>
+          <w:p>
+            <w:pPr>
+              <w:spacing w:after="60" w:before="20" w:line="276" w:lineRule="auto"/>
+              <w:ind w:left="283" w:hanging="198"/>
+            </w:pPr>
+            <w:r>
+              <w:rPr>
+                <w:rFonts w:ascii="Times New Roman" w:hAnsi="Times New Roman" w:cs="Times New Roman"/>
+                <w:b w:val="0"/>
+                <w:i w:val="0"/>
+                <w:sz w:val="22"/>
+              </w:rPr>
+              <w:t xml:space="preserve">4. </w:t>
+            </w:r>
+            <w:r>
+              <w:rPr>
+                <w:rFonts w:ascii="Times New Roman" w:hAnsi="Times New Roman" w:cs="Times New Roman"/>
+                <w:b w:val="0"/>
+                <w:i w:val="0"/>
+                <w:sz w:val="22"/>
+              </w:rPr>
+              <w:t xml:space="preserve">Hệ thống kiểm tra giảng viên được phân công </w:t>
+            </w:r>
+            <w:r>
+              <w:rPr>
+                <w:rFonts w:ascii="Times New Roman" w:hAnsi="Times New Roman" w:cs="Times New Roman"/>
+                <w:b w:val="1"/>
+                <w:i w:val="0"/>
+                <w:sz w:val="22"/>
+              </w:rPr>
+              <w:t xml:space="preserve">trống lịch dạy</w:t>
+            </w:r>
+            <w:r>
+              <w:rPr>
+                <w:rFonts w:ascii="Times New Roman" w:hAnsi="Times New Roman" w:cs="Times New Roman"/>
+                <w:b w:val="0"/>
+                <w:i w:val="0"/>
+                <w:sz w:val="22"/>
+              </w:rPr>
+              <w:t xml:space="preserve">: so sánh với mọi lớp học phần khác (chưa hủy) của cùng giảng viên trong cùng học kỳ; nếu trùng ít nhất một ngày trong tuần và khung giờ giao nhau → Luồng C.</w:t>
+            </w:r>
+          </w:p>
+          <w:p>
+            <w:pPr>
+              <w:spacing w:after="60" w:before="20" w:line="276" w:lineRule="auto"/>
+              <w:ind w:left="283" w:hanging="198"/>
+            </w:pPr>
+            <w:r>
+              <w:rPr>
+                <w:rFonts w:ascii="Times New Roman" w:hAnsi="Times New Roman" w:cs="Times New Roman"/>
+                <w:b w:val="0"/>
+                <w:i w:val="0"/>
+                <w:sz w:val="22"/>
+              </w:rPr>
+              <w:t xml:space="preserve">5. </w:t>
+            </w:r>
+            <w:r>
+              <w:rPr>
+                <w:rFonts w:ascii="Times New Roman" w:hAnsi="Times New Roman" w:cs="Times New Roman"/>
+                <w:b w:val="0"/>
+                <w:i w:val="0"/>
+                <w:sz w:val="22"/>
+              </w:rPr>
+              <w:t xml:space="preserve">Hợp lệ: lưu lớp học phần kèm lịch học. Chức năng </w:t>
+            </w:r>
+            <w:r>
+              <w:rPr>
+                <w:rFonts w:ascii="Times New Roman" w:hAnsi="Times New Roman" w:cs="Times New Roman"/>
+                <w:b w:val="1"/>
+                <w:i w:val="0"/>
+                <w:sz w:val="22"/>
+              </w:rPr>
+              <w:t xml:space="preserve">cập nhật</w:t>
+            </w:r>
+            <w:r>
+              <w:rPr>
+                <w:rFonts w:ascii="Times New Roman" w:hAnsi="Times New Roman" w:cs="Times New Roman"/>
+                <w:b w:val="0"/>
+                <w:i w:val="0"/>
+                <w:sz w:val="22"/>
+              </w:rPr>
+              <w:t xml:space="preserve"> lớp học phần cũng cho sửa lịch học / đổi giảng viên và kiểm tra lại đúng hai bước 3–4 (loại trừ chính lớp đang sửa).</w:t>
+            </w:r>
+          </w:p>
+          <w:p>
+            <w:pPr>
+              <w:spacing w:after="60" w:before="20" w:line="276" w:lineRule="auto"/>
+              <w:ind w:left="283" w:hanging="198"/>
+            </w:pPr>
+            <w:r>
+              <w:rPr>
+                <w:rFonts w:ascii="Times New Roman" w:hAnsi="Times New Roman" w:cs="Times New Roman"/>
+                <w:b w:val="0"/>
+                <w:i w:val="0"/>
+                <w:sz w:val="22"/>
+              </w:rPr>
+              <w:t xml:space="preserve">6. </w:t>
+            </w:r>
+            <w:r>
+              <w:rPr>
+                <w:rFonts w:ascii="Times New Roman" w:hAnsi="Times New Roman" w:cs="Times New Roman"/>
+                <w:b w:val="0"/>
+                <w:i w:val="0"/>
+                <w:sz w:val="22"/>
+              </w:rPr>
+              <w:t xml:space="preserve">Các chức năng khác (đăng ký học phần, thống kê) tự lọc theo các lớp học phần có tên học kỳ khớp với học kỳ đang hoạt động.</w:t>
             </w:r>
           </w:p>
         </w:tc>
@@ -13828,6 +14023,50 @@
                 <w:sz w:val="22"/>
               </w:rPr>
               <w:t>Tên học kỳ trên lớp học phần gõ sai / khác chính tả so với danh sách Học kỳ: lớp đó không xuất hiện trong bộ lọc "học kỳ hiện hành" (hai bảng liên kết bằng so khớp tên — xem mục 3.5.4).</w:t>
+            </w:r>
+          </w:p>
+        </w:tc>
+      </w:tr>
+      <w:tr>
+        <w:tc>
+          <w:tcPr>
+            <w:tcW w:type="dxa" w:w="9071"/>
+            <w:gridSpan w:val="4"/>
+          </w:tcPr>
+          <w:p>
+            <w:pPr>
+              <w:spacing w:after="40" w:before="40" w:line="276" w:lineRule="auto"/>
+            </w:pPr>
+            <w:r>
+              <w:rPr>
+                <w:rFonts w:ascii="Times New Roman" w:hAnsi="Times New Roman" w:cs="Times New Roman"/>
+                <w:b w:val="0"/>
+                <w:i w:val="0"/>
+                <w:sz w:val="22"/>
+              </w:rPr>
+              <w:t xml:space="preserve">Luồng B — Lịch học không hợp lệ (chưa chọn ngày, giờ sai định dạng, giờ bắt đầu không trước giờ kết thúc): từ chối lưu (400) và báo lỗi cụ thể ngay trên biểu mẫu.</w:t>
+            </w:r>
+          </w:p>
+        </w:tc>
+      </w:tr>
+      <w:tr>
+        <w:tc>
+          <w:tcPr>
+            <w:tcW w:type="dxa" w:w="9071"/>
+            <w:gridSpan w:val="4"/>
+          </w:tcPr>
+          <w:p>
+            <w:pPr>
+              <w:spacing w:after="40" w:before="40" w:line="276" w:lineRule="auto"/>
+            </w:pPr>
+            <w:r>
+              <w:rPr>
+                <w:rFonts w:ascii="Times New Roman" w:hAnsi="Times New Roman" w:cs="Times New Roman"/>
+                <w:b w:val="0"/>
+                <w:i w:val="0"/>
+                <w:sz w:val="22"/>
+              </w:rPr>
+              <w:t xml:space="preserve">Luồng C — Giảng viên bị trùng lịch dạy: từ chối lưu (409) kèm thông báo nêu rõ mã lớp, tên môn và lịch của lớp bị trùng (ví dụ "Giáo viên đã có lịch dạy lớp LTCB-HK1-2425 (Lập trình Cơ bản) vào Thứ 2, Thứ 4 · 07:00–09:30…") để Admin chọn giảng viên khác hoặc đổi lịch.</w:t>
             </w:r>
           </w:p>
         </w:tc>
@@ -15764,7 +16003,16 @@
                 <w:i w:val="0"/>
                 <w:sz w:val="22"/>
               </w:rPr>
-              <w:t>1. Sinh viên vào "Đăng ký học phần": hệ thống chỉ hiển thị các lớp đang mở thuộc học kỳ hoạt động.</w:t>
+              <w:t xml:space="preserve">1. </w:t>
+            </w:r>
+            <w:r>
+              <w:rPr>
+                <w:rFonts w:ascii="Times New Roman" w:hAnsi="Times New Roman" w:cs="Times New Roman"/>
+                <w:b w:val="0"/>
+                <w:i w:val="0"/>
+                <w:sz w:val="22"/>
+              </w:rPr>
+              <w:t xml:space="preserve">Sinh viên vào "Đăng ký học phần": hệ thống chỉ hiển thị các lớp đang mở thuộc học kỳ hoạt động, mỗi lớp kèm lịch học (ngày trong tuần + khung giờ). Lớp nào trùng lịch với môn đã đăng ký được gắn sẵn nhãn cảnh báo "Trùng lịch" ngay trên danh sách.</w:t>
             </w:r>
           </w:p>
           <w:p>
@@ -15794,7 +16042,34 @@
                 <w:i w:val="0"/>
                 <w:sz w:val="22"/>
               </w:rPr>
-              <w:t>3. Hệ thống kiểm tra lần lượt: lớp tồn tại và đang mở (không → Luồng A); số người đã đăng ký còn dưới sĩ số tối đa (đầy → Luồng B); sinh viên chưa đăng ký lớp này trước đó (trùng → Luồng C — được chặn thêm bằng ràng buộc duy nhất ở CSDL).</w:t>
+              <w:t xml:space="preserve">3. </w:t>
+            </w:r>
+            <w:r>
+              <w:rPr>
+                <w:rFonts w:ascii="Times New Roman" w:hAnsi="Times New Roman" w:cs="Times New Roman"/>
+                <w:b w:val="0"/>
+                <w:i w:val="0"/>
+                <w:sz w:val="22"/>
+              </w:rPr>
+              <w:t xml:space="preserve">Hệ thống kiểm tra lần lượt: lớp tồn tại và đang mở (không → Luồng A); số người đã đăng ký còn dưới sĩ số tối đa (đầy → Luồng B); sinh viên chưa đăng ký lớp này trước đó (trùng → Luồng C — được chặn thêm bằng ràng buộc duy nhất ở CSDL); lớp </w:t>
+            </w:r>
+            <w:r>
+              <w:rPr>
+                <w:rFonts w:ascii="Times New Roman" w:hAnsi="Times New Roman" w:cs="Times New Roman"/>
+                <w:b w:val="1"/>
+                <w:i w:val="0"/>
+                <w:sz w:val="22"/>
+              </w:rPr>
+              <w:t xml:space="preserve">không trùng lịch học</w:t>
+            </w:r>
+            <w:r>
+              <w:rPr>
+                <w:rFonts w:ascii="Times New Roman" w:hAnsi="Times New Roman" w:cs="Times New Roman"/>
+                <w:b w:val="0"/>
+                <w:i w:val="0"/>
+                <w:sz w:val="22"/>
+              </w:rPr>
+              <w:t xml:space="preserve"> với bất kỳ môn nào sinh viên đã đăng ký trong cùng học kỳ — trùng ít nhất một ngày trong tuần và khung giờ giao nhau bị coi là xung đột (trùng → Luồng D).</w:t>
             </w:r>
           </w:p>
           <w:p>
@@ -15926,6 +16201,28 @@
                 <w:sz w:val="22"/>
               </w:rPr>
               <w:t>Đã đăng ký: báo lỗi trùng.</w:t>
+            </w:r>
+          </w:p>
+        </w:tc>
+      </w:tr>
+      <w:tr>
+        <w:tc>
+          <w:tcPr>
+            <w:tcW w:type="dxa" w:w="9071"/>
+            <w:gridSpan w:val="4"/>
+          </w:tcPr>
+          <w:p>
+            <w:pPr>
+              <w:spacing w:after="40" w:before="40" w:line="276" w:lineRule="auto"/>
+            </w:pPr>
+            <w:r>
+              <w:rPr>
+                <w:rFonts w:ascii="Times New Roman" w:hAnsi="Times New Roman" w:cs="Times New Roman"/>
+                <w:b w:val="0"/>
+                <w:i w:val="0"/>
+                <w:sz w:val="22"/>
+              </w:rPr>
+              <w:t xml:space="preserve">Luồng D — Trùng lịch học: từ chối đăng ký (409) kèm thông báo nêu rõ lớp bị trùng và lịch của lớp đó (ví dụ "Trùng lịch học: bạn đã đăng ký lớp TA1-HK1-2425 (Tiếng Anh 1) vào Thứ 6 · 07:00–09:30…"), đảm bảo sinh viên không thể có hai môn học cùng ngày, cùng giờ.</w:t>
             </w:r>
           </w:p>
         </w:tc>
@@ -16489,7 +16786,7 @@
                 <w:i w:val="0"/>
                 <w:sz w:val="22"/>
               </w:rPr>
-              <w:t>Xem danh sách môn học nhóm theo học kỳ: sinh viên xem môn đã đăng ký (lịch học); giảng viên xem lớp được phân công (lịch dạy).</w:t>
+              <w:t xml:space="preserve">Xem danh sách môn học nhóm theo học kỳ kèm lịch học trong tuần: sinh viên xem môn đã đăng ký học vào những ngày nào, giờ nào (lịch học); giảng viên xem lớp được phân công dạy vào những ngày nào, giờ nào (lịch dạy).</w:t>
             </w:r>
           </w:p>
         </w:tc>
@@ -16631,7 +16928,40 @@
                 <w:i w:val="0"/>
                 <w:sz w:val="22"/>
               </w:rPr>
-              <w:t>3. Dữ liệu được nhóm theo học kỳ; chưa có dữ liệu thì hiển thị trạng thái trống thân thiện.</w:t>
+              <w:t xml:space="preserve">3. </w:t>
+            </w:r>
+            <w:r>
+              <w:rPr>
+                <w:rFonts w:ascii="Times New Roman" w:hAnsi="Times New Roman" w:cs="Times New Roman"/>
+                <w:b w:val="0"/>
+                <w:i w:val="0"/>
+                <w:sz w:val="22"/>
+              </w:rPr>
+              <w:t xml:space="preserve">Mỗi môn / lớp hiển thị rõ lịch học trong tuần dạng "Thứ 2, Thứ 4 · 07:00–09:30" trên cả thẻ tóm tắt và cột "Lịch học" trong bảng chi tiết; giảng viên còn thấy lịch dạy ngay trên Dashboard và màn hình "Lớp của tôi", sinh viên thấy lịch học trên Dashboard và các thẻ môn học.</w:t>
+            </w:r>
+          </w:p>
+          <w:p>
+            <w:pPr>
+              <w:spacing w:after="60" w:before="20" w:line="276" w:lineRule="auto"/>
+              <w:ind w:left="283" w:hanging="198"/>
+            </w:pPr>
+            <w:r>
+              <w:rPr>
+                <w:rFonts w:ascii="Times New Roman" w:hAnsi="Times New Roman" w:cs="Times New Roman"/>
+                <w:b w:val="0"/>
+                <w:i w:val="0"/>
+                <w:sz w:val="22"/>
+              </w:rPr>
+              <w:t xml:space="preserve">4. </w:t>
+            </w:r>
+            <w:r>
+              <w:rPr>
+                <w:rFonts w:ascii="Times New Roman" w:hAnsi="Times New Roman" w:cs="Times New Roman"/>
+                <w:b w:val="0"/>
+                <w:i w:val="0"/>
+                <w:sz w:val="22"/>
+              </w:rPr>
+              <w:t xml:space="preserve">Dữ liệu được nhóm theo học kỳ; chưa có dữ liệu thì hiển thị trạng thái trống thân thiện.</w:t>
             </w:r>
           </w:p>
         </w:tc>
@@ -21265,7 +21595,7 @@
                 <w:i w:val="0"/>
                 <w:sz w:val="22"/>
               </w:rPr>
-              <w:t>6</w:t>
+              <w:t xml:space="preserve">6</w:t>
             </w:r>
           </w:p>
         </w:tc>
@@ -21284,7 +21614,7 @@
                 <w:i w:val="0"/>
                 <w:sz w:val="22"/>
               </w:rPr>
-              <w:t>subjectId</w:t>
+              <w:t xml:space="preserve">scheduleDays</w:t>
             </w:r>
           </w:p>
         </w:tc>
@@ -21303,7 +21633,7 @@
                 <w:i w:val="0"/>
                 <w:sz w:val="22"/>
               </w:rPr>
-              <w:t>UUID (FK → subjects)</w:t>
+              <w:t xml:space="preserve">Mảng Int, mặc định rỗng</w:t>
             </w:r>
           </w:p>
         </w:tc>
@@ -21322,7 +21652,7 @@
                 <w:i w:val="0"/>
                 <w:sz w:val="22"/>
               </w:rPr>
-              <w:t>Môn học được mở lớp</w:t>
+              <w:t xml:space="preserve">Các ngày học trong tuần: 1 = Thứ 2 … 6 = Thứ 7, 7 = Chủ nhật</w:t>
             </w:r>
           </w:p>
         </w:tc>
@@ -21343,7 +21673,241 @@
                 <w:i w:val="0"/>
                 <w:sz w:val="22"/>
               </w:rPr>
-              <w:t>7</w:t>
+              <w:t xml:space="preserve">7</w:t>
+            </w:r>
+          </w:p>
+        </w:tc>
+        <w:tc>
+          <w:tcPr>
+            <w:tcW w:type="dxa" w:w="2268"/>
+          </w:tcPr>
+          <w:p>
+            <w:pPr>
+              <w:spacing w:after="40" w:before="40" w:line="264" w:lineRule="auto"/>
+            </w:pPr>
+            <w:r>
+              <w:rPr>
+                <w:rFonts w:ascii="Times New Roman" w:hAnsi="Times New Roman" w:cs="Times New Roman"/>
+                <w:b w:val="0"/>
+                <w:i w:val="0"/>
+                <w:sz w:val="22"/>
+              </w:rPr>
+              <w:t xml:space="preserve">startTime</w:t>
+            </w:r>
+          </w:p>
+        </w:tc>
+        <w:tc>
+          <w:tcPr>
+            <w:tcW w:type="dxa" w:w="2268"/>
+          </w:tcPr>
+          <w:p>
+            <w:pPr>
+              <w:spacing w:after="40" w:before="40" w:line="264" w:lineRule="auto"/>
+            </w:pPr>
+            <w:r>
+              <w:rPr>
+                <w:rFonts w:ascii="Times New Roman" w:hAnsi="Times New Roman" w:cs="Times New Roman"/>
+                <w:b w:val="0"/>
+                <w:i w:val="0"/>
+                <w:sz w:val="22"/>
+              </w:rPr>
+              <w:t xml:space="preserve">String, tùy chọn</w:t>
+            </w:r>
+          </w:p>
+        </w:tc>
+        <w:tc>
+          <w:tcPr>
+            <w:tcW w:type="dxa" w:w="2268"/>
+          </w:tcPr>
+          <w:p>
+            <w:pPr>
+              <w:spacing w:after="40" w:before="40" w:line="264" w:lineRule="auto"/>
+            </w:pPr>
+            <w:r>
+              <w:rPr>
+                <w:rFonts w:ascii="Times New Roman" w:hAnsi="Times New Roman" w:cs="Times New Roman"/>
+                <w:b w:val="0"/>
+                <w:i w:val="0"/>
+                <w:sz w:val="22"/>
+              </w:rPr>
+              <w:t xml:space="preserve">Giờ bắt đầu buổi học, định dạng "HH:mm" (ví dụ "07:00")</w:t>
+            </w:r>
+          </w:p>
+        </w:tc>
+      </w:tr>
+      <w:tr>
+        <w:tc>
+          <w:tcPr>
+            <w:tcW w:type="dxa" w:w="2268"/>
+          </w:tcPr>
+          <w:p>
+            <w:pPr>
+              <w:spacing w:after="40" w:before="40" w:line="264" w:lineRule="auto"/>
+            </w:pPr>
+            <w:r>
+              <w:rPr>
+                <w:rFonts w:ascii="Times New Roman" w:hAnsi="Times New Roman" w:cs="Times New Roman"/>
+                <w:b w:val="0"/>
+                <w:i w:val="0"/>
+                <w:sz w:val="22"/>
+              </w:rPr>
+              <w:t xml:space="preserve">8</w:t>
+            </w:r>
+          </w:p>
+        </w:tc>
+        <w:tc>
+          <w:tcPr>
+            <w:tcW w:type="dxa" w:w="2268"/>
+          </w:tcPr>
+          <w:p>
+            <w:pPr>
+              <w:spacing w:after="40" w:before="40" w:line="264" w:lineRule="auto"/>
+            </w:pPr>
+            <w:r>
+              <w:rPr>
+                <w:rFonts w:ascii="Times New Roman" w:hAnsi="Times New Roman" w:cs="Times New Roman"/>
+                <w:b w:val="0"/>
+                <w:i w:val="0"/>
+                <w:sz w:val="22"/>
+              </w:rPr>
+              <w:t xml:space="preserve">endTime</w:t>
+            </w:r>
+          </w:p>
+        </w:tc>
+        <w:tc>
+          <w:tcPr>
+            <w:tcW w:type="dxa" w:w="2268"/>
+          </w:tcPr>
+          <w:p>
+            <w:pPr>
+              <w:spacing w:after="40" w:before="40" w:line="264" w:lineRule="auto"/>
+            </w:pPr>
+            <w:r>
+              <w:rPr>
+                <w:rFonts w:ascii="Times New Roman" w:hAnsi="Times New Roman" w:cs="Times New Roman"/>
+                <w:b w:val="0"/>
+                <w:i w:val="0"/>
+                <w:sz w:val="22"/>
+              </w:rPr>
+              <w:t xml:space="preserve">String, tùy chọn</w:t>
+            </w:r>
+          </w:p>
+        </w:tc>
+        <w:tc>
+          <w:tcPr>
+            <w:tcW w:type="dxa" w:w="2268"/>
+          </w:tcPr>
+          <w:p>
+            <w:pPr>
+              <w:spacing w:after="40" w:before="40" w:line="264" w:lineRule="auto"/>
+            </w:pPr>
+            <w:r>
+              <w:rPr>
+                <w:rFonts w:ascii="Times New Roman" w:hAnsi="Times New Roman" w:cs="Times New Roman"/>
+                <w:b w:val="0"/>
+                <w:i w:val="0"/>
+                <w:sz w:val="22"/>
+              </w:rPr>
+              <w:t xml:space="preserve">Giờ kết thúc buổi học, định dạng "HH:mm" (ví dụ "09:30")</w:t>
+            </w:r>
+          </w:p>
+        </w:tc>
+      </w:tr>
+      <w:tr>
+        <w:tc>
+          <w:tcPr>
+            <w:tcW w:type="dxa" w:w="2268"/>
+          </w:tcPr>
+          <w:p>
+            <w:pPr>
+              <w:spacing w:after="40" w:before="40" w:line="264" w:lineRule="auto"/>
+            </w:pPr>
+            <w:r>
+              <w:rPr>
+                <w:rFonts w:ascii="Times New Roman" w:hAnsi="Times New Roman" w:cs="Times New Roman"/>
+                <w:b w:val="0"/>
+                <w:i w:val="0"/>
+                <w:sz w:val="22"/>
+              </w:rPr>
+              <w:t xml:space="preserve">9</w:t>
+            </w:r>
+          </w:p>
+        </w:tc>
+        <w:tc>
+          <w:tcPr>
+            <w:tcW w:type="dxa" w:w="2268"/>
+          </w:tcPr>
+          <w:p>
+            <w:pPr>
+              <w:spacing w:after="40" w:before="40" w:line="264" w:lineRule="auto"/>
+            </w:pPr>
+            <w:r>
+              <w:rPr>
+                <w:rFonts w:ascii="Times New Roman" w:hAnsi="Times New Roman" w:cs="Times New Roman"/>
+                <w:b w:val="0"/>
+                <w:i w:val="0"/>
+                <w:sz w:val="22"/>
+              </w:rPr>
+              <w:t>subjectId</w:t>
+            </w:r>
+          </w:p>
+        </w:tc>
+        <w:tc>
+          <w:tcPr>
+            <w:tcW w:type="dxa" w:w="2268"/>
+          </w:tcPr>
+          <w:p>
+            <w:pPr>
+              <w:spacing w:after="40" w:before="40" w:line="264" w:lineRule="auto"/>
+            </w:pPr>
+            <w:r>
+              <w:rPr>
+                <w:rFonts w:ascii="Times New Roman" w:hAnsi="Times New Roman" w:cs="Times New Roman"/>
+                <w:b w:val="0"/>
+                <w:i w:val="0"/>
+                <w:sz w:val="22"/>
+              </w:rPr>
+              <w:t>UUID (FK → subjects)</w:t>
+            </w:r>
+          </w:p>
+        </w:tc>
+        <w:tc>
+          <w:tcPr>
+            <w:tcW w:type="dxa" w:w="2268"/>
+          </w:tcPr>
+          <w:p>
+            <w:pPr>
+              <w:spacing w:after="40" w:before="40" w:line="264" w:lineRule="auto"/>
+            </w:pPr>
+            <w:r>
+              <w:rPr>
+                <w:rFonts w:ascii="Times New Roman" w:hAnsi="Times New Roman" w:cs="Times New Roman"/>
+                <w:b w:val="0"/>
+                <w:i w:val="0"/>
+                <w:sz w:val="22"/>
+              </w:rPr>
+              <w:t>Môn học được mở lớp</w:t>
+            </w:r>
+          </w:p>
+        </w:tc>
+      </w:tr>
+      <w:tr>
+        <w:tc>
+          <w:tcPr>
+            <w:tcW w:type="dxa" w:w="2268"/>
+          </w:tcPr>
+          <w:p>
+            <w:pPr>
+              <w:spacing w:after="40" w:before="40" w:line="264" w:lineRule="auto"/>
+            </w:pPr>
+            <w:r>
+              <w:rPr>
+                <w:rFonts w:ascii="Times New Roman" w:hAnsi="Times New Roman" w:cs="Times New Roman"/>
+                <w:b w:val="0"/>
+                <w:i w:val="0"/>
+                <w:sz w:val="22"/>
+              </w:rPr>
+              <w:t xml:space="preserve">10</w:t>
             </w:r>
           </w:p>
         </w:tc>
@@ -25562,6 +26126,158 @@
           <w:sz w:val="26"/>
         </w:rPr>
         <w:t>Do liên kết bằng so khớp tên, việc đổi tên một Học kỳ sẽ không tự cập nhật các lớp học phần đã lưu tên cũ — đây là điểm cần lưu ý khi vận hành (xem phần Hạn chế).</w:t>
+      </w:r>
+    </w:p>
+    <w:p>
+      <w:pPr>
+        <w:pStyle w:val="Heading3"/>
+        <w:keepNext/>
+        <w:spacing w:line="300" w:lineRule="auto" w:before="200" w:after="120"/>
+      </w:pPr>
+      <w:r>
+        <w:rPr>
+          <w:rFonts w:ascii="Times New Roman" w:hAnsi="Times New Roman" w:cs="Times New Roman"/>
+          <w:b w:val="0"/>
+          <w:i w:val="0"/>
+          <w:color w:val="2E5A9C"/>
+          <w:sz w:val="26"/>
+        </w:rPr>
+        <w:t xml:space="preserve">3.5.5. Lịch học trong tuần và quy tắc chống trùng lịch</w:t>
+      </w:r>
+    </w:p>
+    <w:p>
+      <w:pPr>
+        <w:spacing w:after="120" w:before="0" w:line="300" w:lineRule="auto"/>
+        <w:jc w:val="both"/>
+      </w:pPr>
+      <w:r>
+        <w:rPr>
+          <w:rFonts w:ascii="Times New Roman" w:hAnsi="Times New Roman" w:cs="Times New Roman"/>
+          <w:b w:val="0"/>
+          <w:i w:val="0"/>
+          <w:sz w:val="26"/>
+        </w:rPr>
+        <w:t xml:space="preserve">Mỗi lớp học phần mang lịch học lặp hằng tuần, lưu ngay trên bảng subject_classes bằng ba trường: scheduleDays (mảng các ngày trong tuần, 1 = Thứ 2 … 7 = Chủ nhật), startTime và endTime (chuỗi "HH:mm"). Ví dụ lớp dạy Thứ 3 – Thứ 5, 07:00–09:30 được lưu là scheduleDays = [2, 4], startTime = "07:00", endTime = "09:30".</w:t>
+      </w:r>
+    </w:p>
+    <w:p>
+      <w:pPr>
+        <w:spacing w:after="120" w:before="0" w:line="300" w:lineRule="auto"/>
+        <w:jc w:val="both"/>
+      </w:pPr>
+      <w:r>
+        <w:rPr>
+          <w:rFonts w:ascii="Times New Roman" w:hAnsi="Times New Roman" w:cs="Times New Roman"/>
+          <w:b w:val="0"/>
+          <w:i w:val="0"/>
+          <w:sz w:val="26"/>
+        </w:rPr>
+        <w:t xml:space="preserve">Hai lớp học phần bị coi là </w:t>
+      </w:r>
+      <w:r>
+        <w:rPr>
+          <w:rFonts w:ascii="Times New Roman" w:hAnsi="Times New Roman" w:cs="Times New Roman"/>
+          <w:b w:val="1"/>
+          <w:i w:val="0"/>
+          <w:sz w:val="26"/>
+        </w:rPr>
+        <w:t xml:space="preserve">trùng lịch</w:t>
+      </w:r>
+      <w:r>
+        <w:rPr>
+          <w:rFonts w:ascii="Times New Roman" w:hAnsi="Times New Roman" w:cs="Times New Roman"/>
+          <w:b w:val="0"/>
+          <w:i w:val="0"/>
+          <w:sz w:val="26"/>
+        </w:rPr>
+        <w:t xml:space="preserve"> khi thỏa đồng thời ba điều kiện:</w:t>
+      </w:r>
+    </w:p>
+    <w:p>
+      <w:pPr>
+        <w:spacing w:after="80" w:before="0" w:line="300" w:lineRule="auto"/>
+        <w:ind w:left="425" w:hanging="198"/>
+      </w:pPr>
+      <w:r>
+        <w:rPr>
+          <w:rFonts w:ascii="Times New Roman" w:hAnsi="Times New Roman" w:cs="Times New Roman"/>
+          <w:b w:val="0"/>
+          <w:i w:val="0"/>
+          <w:sz w:val="26"/>
+        </w:rPr>
+        <w:t xml:space="preserve">1.  </w:t>
+      </w:r>
+      <w:r>
+        <w:rPr>
+          <w:rFonts w:ascii="Times New Roman" w:hAnsi="Times New Roman" w:cs="Times New Roman"/>
+          <w:b w:val="0"/>
+          <w:i w:val="0"/>
+          <w:sz w:val="26"/>
+        </w:rPr>
+        <w:t xml:space="preserve">Cùng tên học kỳ (lịch chỉ so sánh trong phạm vi một học kỳ);</w:t>
+      </w:r>
+    </w:p>
+    <w:p>
+      <w:pPr>
+        <w:spacing w:after="80" w:before="0" w:line="300" w:lineRule="auto"/>
+        <w:ind w:left="425" w:hanging="198"/>
+      </w:pPr>
+      <w:r>
+        <w:rPr>
+          <w:rFonts w:ascii="Times New Roman" w:hAnsi="Times New Roman" w:cs="Times New Roman"/>
+          <w:b w:val="0"/>
+          <w:i w:val="0"/>
+          <w:sz w:val="26"/>
+        </w:rPr>
+        <w:t xml:space="preserve">2.  </w:t>
+      </w:r>
+      <w:r>
+        <w:rPr>
+          <w:rFonts w:ascii="Times New Roman" w:hAnsi="Times New Roman" w:cs="Times New Roman"/>
+          <w:b w:val="0"/>
+          <w:i w:val="0"/>
+          <w:sz w:val="26"/>
+        </w:rPr>
+        <w:t xml:space="preserve">Có ít nhất một ngày học trong tuần trùng nhau;</w:t>
+      </w:r>
+    </w:p>
+    <w:p>
+      <w:pPr>
+        <w:spacing w:after="80" w:before="0" w:line="300" w:lineRule="auto"/>
+        <w:ind w:left="425" w:hanging="198"/>
+      </w:pPr>
+      <w:r>
+        <w:rPr>
+          <w:rFonts w:ascii="Times New Roman" w:hAnsi="Times New Roman" w:cs="Times New Roman"/>
+          <w:b w:val="0"/>
+          <w:i w:val="0"/>
+          <w:sz w:val="26"/>
+        </w:rPr>
+        <w:t xml:space="preserve">3.  </w:t>
+      </w:r>
+      <w:r>
+        <w:rPr>
+          <w:rFonts w:ascii="Times New Roman" w:hAnsi="Times New Roman" w:cs="Times New Roman"/>
+          <w:b w:val="0"/>
+          <w:i w:val="0"/>
+          <w:sz w:val="26"/>
+        </w:rPr>
+        <w:t xml:space="preserve">Hai khoảng giờ giao nhau (giờ bắt đầu của lớp này nhỏ hơn giờ kết thúc của lớp kia và ngược lại).</w:t>
+      </w:r>
+    </w:p>
+    <w:p>
+      <w:pPr>
+        <w:spacing w:after="120" w:before="0" w:line="300" w:lineRule="auto"/>
+        <w:jc w:val="both"/>
+      </w:pPr>
+      <w:r>
+        <w:rPr>
+          <w:rFonts w:ascii="Times New Roman" w:hAnsi="Times New Roman" w:cs="Times New Roman"/>
+          <w:b w:val="0"/>
+          <w:i w:val="0"/>
+          <w:sz w:val="26"/>
+        </w:rPr>
+        <w:t xml:space="preserve">Quy tắc này được cài đặt một lần trong tiện ích dùng chung phía server (src/common/utils/schedule.util.ts) và áp dụng cho hai nghiệp vụ: (1) khi Admin tạo / cập nhật lớp học phần — giảng viên được phân công phải trống lịch, lớp đã hủy không tính; (2) khi sinh viên đăng ký học phần — lớp mới không được trùng lịch với các môn đã đăng ký. Vi phạm sẽ bị từ chối với mã lỗi 409 kèm thông báo nêu rõ lớp bị trùng và lịch của lớp đó. Phía client có bộ tiện ích tương ứng (src/constants/schedule.constants.js) để hiển thị lịch dạng "Thứ 2, Thứ 4 · 07:00–09:30" và cảnh báo sớm "Trùng lịch" ngay trên danh sách đăng ký.</w:t>
       </w:r>
     </w:p>
     <w:p>
@@ -27149,11 +27865,11 @@
       <w:r>
         <w:rPr>
           <w:rFonts w:ascii="Times New Roman" w:hAnsi="Times New Roman" w:cs="Times New Roman"/>
-          <w:b/>
+          <w:b w:val="1"/>
           <w:i w:val="0"/>
           <w:sz w:val="26"/>
         </w:rPr>
-        <w:t>Quản lý Lớp học phần</w:t>
+        <w:t xml:space="preserve">Quản lý Lớp học phần</w:t>
       </w:r>
       <w:r>
         <w:rPr>
@@ -27162,7 +27878,7 @@
           <w:i w:val="0"/>
           <w:sz w:val="26"/>
         </w:rPr>
-        <w:t>: mở lớp gắn Môn học + Giảng viên + Học kỳ, đặt sĩ số tối đa và trạng thái.</w:t>
+        <w:t xml:space="preserve">: mở lớp gắn Môn học + Giảng viên + Học kỳ, đặt sĩ số tối đa và trạng thái; chọn lịch học trong tuần bằng các nút ngày (T2 → CN) và hai ô giờ bắt đầu / kết thúc — áp dụng cho cả tạo mới và cập nhật; lịch của từng lớp hiển thị ngay trên thẻ danh sách; nếu giảng viên được phân công bị trùng lịch dạy, hệ thống báo lỗi nêu rõ lớp bị trùng.</w:t>
       </w:r>
     </w:p>
     <w:p>
@@ -27232,11 +27948,11 @@
       <w:r>
         <w:rPr>
           <w:rFonts w:ascii="Times New Roman" w:hAnsi="Times New Roman" w:cs="Times New Roman"/>
-          <w:b/>
+          <w:b w:val="1"/>
           <w:i w:val="0"/>
           <w:sz w:val="26"/>
         </w:rPr>
-        <w:t>Dashboard</w:t>
+        <w:t xml:space="preserve">Dashboard</w:t>
       </w:r>
       <w:r>
         <w:rPr>
@@ -27245,7 +27961,7 @@
           <w:i w:val="0"/>
           <w:sz w:val="26"/>
         </w:rPr>
-        <w:t>: số lớp phụ trách trong học kỳ hiện hành, tổng sinh viên, tỷ lệ điểm danh, số bài chưa chấm, biểu đồ xu hướng điểm danh 8 buổi gần nhất.</w:t>
+        <w:t xml:space="preserve">: số lớp phụ trách trong học kỳ hiện hành, tổng sinh viên, tỷ lệ điểm danh, số bài chưa chấm, biểu đồ xu hướng điểm danh 8 buổi gần nhất; danh sách lớp phụ trách kèm lịch dạy từng lớp.</w:t>
       </w:r>
     </w:p>
     <w:p>
@@ -27265,11 +27981,11 @@
       <w:r>
         <w:rPr>
           <w:rFonts w:ascii="Times New Roman" w:hAnsi="Times New Roman" w:cs="Times New Roman"/>
-          <w:b/>
+          <w:b w:val="1"/>
           <w:i w:val="0"/>
           <w:sz w:val="26"/>
         </w:rPr>
-        <w:t>Lớp của tôi</w:t>
+        <w:t xml:space="preserve">Lớp của tôi</w:t>
       </w:r>
       <w:r>
         <w:rPr>
@@ -27278,7 +27994,7 @@
           <w:i w:val="0"/>
           <w:sz w:val="26"/>
         </w:rPr>
-        <w:t>: danh sách lớp học phần được phân công kèm sĩ số; xem danh sách sinh viên từng lớp.</w:t>
+        <w:t xml:space="preserve">: danh sách lớp học phần được phân công kèm sĩ số và lịch dạy trong tuần (ngày học + khung giờ, ví dụ "Thứ 2, Thứ 4 · 07:00–09:30"); xem danh sách sinh viên từng lớp.</w:t>
       </w:r>
     </w:p>
     <w:p>
@@ -27364,11 +28080,11 @@
       <w:r>
         <w:rPr>
           <w:rFonts w:ascii="Times New Roman" w:hAnsi="Times New Roman" w:cs="Times New Roman"/>
-          <w:b/>
+          <w:b w:val="1"/>
           <w:i w:val="0"/>
           <w:sz w:val="26"/>
         </w:rPr>
-        <w:t>Lịch dạy</w:t>
+        <w:t xml:space="preserve">Lịch dạy</w:t>
       </w:r>
       <w:r>
         <w:rPr>
@@ -27377,7 +28093,7 @@
           <w:i w:val="0"/>
           <w:sz w:val="26"/>
         </w:rPr>
-        <w:t>: các lớp phụ trách nhóm theo học kỳ.</w:t>
+        <w:t xml:space="preserve">: các lớp phụ trách nhóm theo học kỳ, mỗi lớp hiển thị rõ dạy vào những thứ nào và từ giờ nào đến giờ nào, trên cả thẻ tóm tắt và cột "Lịch học" trong bảng.</w:t>
       </w:r>
     </w:p>
     <w:p>
@@ -27414,11 +28130,11 @@
       <w:r>
         <w:rPr>
           <w:rFonts w:ascii="Times New Roman" w:hAnsi="Times New Roman" w:cs="Times New Roman"/>
-          <w:b/>
+          <w:b w:val="1"/>
           <w:i w:val="0"/>
           <w:sz w:val="26"/>
         </w:rPr>
-        <w:t>Dashboard</w:t>
+        <w:t xml:space="preserve">Dashboard</w:t>
       </w:r>
       <w:r>
         <w:rPr>
@@ -27427,7 +28143,7 @@
           <w:i w:val="0"/>
           <w:sz w:val="26"/>
         </w:rPr>
-        <w:t>: tín chỉ đang học, GPA hiện tại, tỷ lệ điểm danh cá nhân, biểu đồ xu hướng GPA theo học kỳ.</w:t>
+        <w:t xml:space="preserve">: tín chỉ đang học, GPA hiện tại, tỷ lệ điểm danh cá nhân, biểu đồ xu hướng GPA theo học kỳ; các môn học kỳ này kèm lịch học từng môn.</w:t>
       </w:r>
     </w:p>
     <w:p>
@@ -27447,11 +28163,11 @@
       <w:r>
         <w:rPr>
           <w:rFonts w:ascii="Times New Roman" w:hAnsi="Times New Roman" w:cs="Times New Roman"/>
-          <w:b/>
+          <w:b w:val="1"/>
           <w:i w:val="0"/>
           <w:sz w:val="26"/>
         </w:rPr>
-        <w:t>Đăng ký học phần</w:t>
+        <w:t xml:space="preserve">Đăng ký học phần</w:t>
       </w:r>
       <w:r>
         <w:rPr>
@@ -27460,7 +28176,7 @@
           <w:i w:val="0"/>
           <w:sz w:val="26"/>
         </w:rPr>
-        <w:t>: danh sách lớp đang mở của học kỳ hoạt động kèm số chỗ còn lại; đăng ký một chạm; báo lỗi rõ ràng khi lớp đầy hoặc đã đăng ký.</w:t>
+        <w:t xml:space="preserve">: danh sách lớp đang mở của học kỳ hoạt động kèm số chỗ còn lại và lịch học từng lớp; lớp trùng lịch với môn đã đăng ký được gắn nhãn cảnh báo "Trùng lịch" ngay trên danh sách; đăng ký một chạm; báo lỗi rõ ràng khi lớp đầy, đã đăng ký hoặc trùng lịch học; giỏ đăng ký bên phải hiển thị lịch học các môn đã chọn.</w:t>
       </w:r>
     </w:p>
     <w:p>
@@ -27480,11 +28196,11 @@
       <w:r>
         <w:rPr>
           <w:rFonts w:ascii="Times New Roman" w:hAnsi="Times New Roman" w:cs="Times New Roman"/>
-          <w:b/>
+          <w:b w:val="1"/>
           <w:i w:val="0"/>
           <w:sz w:val="26"/>
         </w:rPr>
-        <w:t>Môn của tôi / Lịch học</w:t>
+        <w:t xml:space="preserve">Môn của tôi / Lịch học</w:t>
       </w:r>
       <w:r>
         <w:rPr>
@@ -27493,7 +28209,7 @@
           <w:i w:val="0"/>
           <w:sz w:val="26"/>
         </w:rPr>
-        <w:t>: các môn đã đăng ký nhóm theo học kỳ; hủy đăng ký khi điểm chưa khóa.</w:t>
+        <w:t xml:space="preserve">: các môn đã đăng ký nhóm theo học kỳ, mỗi môn hiển thị rõ học vào những thứ nào và từ giờ nào đến giờ nào; hủy đăng ký khi điểm chưa khóa.</w:t>
       </w:r>
     </w:p>
     <w:p>
@@ -27983,6 +28699,30 @@
           <w:sz w:val="26"/>
         </w:rPr>
         <w:t>Các nghiệp vụ chính (đăng nhập, quên mật khẩu, tạo tài khoản, nhập hàng loạt, đăng ký học phần, điểm danh, nhập điểm, khóa điểm) đã được kiểm thử thủ công theo kịch bản trên cả ba vai trò, bao gồm các nhánh lỗi (sai mật khẩu, tài khoản bị khóa, lớp đầy, điểm đã khóa, dữ liệu nhập hàng loạt có dòng lỗi…).</w:t>
+      </w:r>
+    </w:p>
+    <w:p>
+      <w:pPr>
+        <w:spacing w:after="80" w:before="0" w:line="300" w:lineRule="auto"/>
+        <w:ind w:left="425" w:hanging="198"/>
+      </w:pPr>
+      <w:r>
+        <w:rPr>
+          <w:rFonts w:ascii="Times New Roman" w:hAnsi="Times New Roman" w:cs="Times New Roman"/>
+          <w:b w:val="0"/>
+          <w:i w:val="0"/>
+          <w:sz w:val="26"/>
+        </w:rPr>
+        <w:t xml:space="preserve">•  </w:t>
+      </w:r>
+      <w:r>
+        <w:rPr>
+          <w:rFonts w:ascii="Times New Roman" w:hAnsi="Times New Roman" w:cs="Times New Roman"/>
+          <w:b w:val="0"/>
+          <w:i w:val="0"/>
+          <w:sz w:val="26"/>
+        </w:rPr>
+        <w:t xml:space="preserve">Nghiệp vụ lịch học được kiểm thử tự động đầu-cuối qua API với đầy đủ các nhánh: tạo lớp thiếu ngày học / giờ sai thứ tự (bị chặn 400); phân công giảng viên trùng lịch khi tạo mới và khi cập nhật (bị chặn 409, thông báo nêu rõ lớp trùng); cùng khung giờ nhưng khác học kỳ (cho phép); sinh viên đăng ký lớp trùng lịch (bị chặn 409) và lớp không trùng lịch (thành công); các chức năng cũ (hủy đăng ký, xem lịch, bảng điểm) không bị ảnh hưởng.</w:t>
       </w:r>
     </w:p>
     <w:p>
@@ -28144,7 +28884,7 @@
           <w:i w:val="0"/>
           <w:sz w:val="26"/>
         </w:rPr>
-        <w:t>Số hóa trọn chuỗi nghiệp vụ học vụ: mở lớp theo học kỳ → đăng ký có kiểm soát sĩ số → điểm danh chống trùng → nhập điểm tự tính xếp loại → khóa điểm → bảng điểm và GPA.</w:t>
+        <w:t xml:space="preserve">Số hóa trọn chuỗi nghiệp vụ học vụ: mở lớp theo học kỳ kèm lịch học trong tuần (ngày học + khung giờ) → phân công giảng viên có kiểm tra trống lịch → đăng ký có kiểm soát sĩ số và chống trùng lịch học → điểm danh chống trùng → nhập điểm tự tính xếp loại → khóa điểm → bảng điểm và GPA.</w:t>
       </w:r>
     </w:p>
     <w:p>
@@ -28442,7 +29182,7 @@
           <w:i w:val="0"/>
           <w:sz w:val="26"/>
         </w:rPr>
-        <w:t>Mở rộng thời khóa biểu theo tiết học / phòng học và tích hợp lịch (iCal) cho sinh viên, giảng viên.</w:t>
+        <w:t xml:space="preserve">Mở rộng lịch học trong tuần hiện có (ngày học + khung giờ) theo tiết học chuẩn / phòng học, hiển thị dạng thời khóa biểu lưới tuần và tích hợp lịch (iCal) cho sinh viên, giảng viên.</w:t>
       </w:r>
     </w:p>
     <w:sectPr>

</xml_diff>

<commit_message>
Update document and loading icon
</commit_message>
<xml_diff>
--- a/documents/EduManage_Tai_Lieu_Thuyet_Trinh_v3.docx
+++ b/documents/EduManage_Tai_Lieu_Thuyet_Trinh_v3.docx
@@ -5522,7 +5522,7 @@
           <w:i w:val="0"/>
           <w:sz w:val="26"/>
         </w:rPr>
-        <w:t xml:space="preserve">•  </w:t>
+        <w:t>•  Đăng nhập bằng mã tài khoản + mật khẩu (hệ thống tự xác định vai trò Admin / Giảng viên / Sinh viên từ tài khoản, không cần chọn vai trò), đăng xuất.</w:t>
       </w:r>
       <w:r>
         <w:rPr>
@@ -5531,7 +5531,6 @@
           <w:i w:val="0"/>
           <w:sz w:val="26"/>
         </w:rPr>
-        <w:t>Đăng nhập theo vai trò (ba tab Admin / Giảng viên / Sinh viên, kiểm tra định dạng mã tài khoản theo vai trò ngay tại giao diện), đăng xuất.</w:t>
       </w:r>
     </w:p>
     <w:p>
@@ -6371,7 +6370,7 @@
                 <w:i w:val="0"/>
                 <w:sz w:val="22"/>
               </w:rPr>
-              <w:t>Đăng nhập (theo vai trò)</w:t>
+              <w:t>Đăng nhập</w:t>
             </w:r>
           </w:p>
         </w:tc>
@@ -8455,7 +8454,7 @@
           <w:color w:val="2E5A9C"/>
           <w:sz w:val="26"/>
         </w:rPr>
-        <w:t>UC#01: Đăng nhập (theo vai trò)</w:t>
+        <w:t>UC#01: Đăng nhập</w:t>
       </w:r>
     </w:p>
     <w:tbl>
@@ -8512,7 +8511,7 @@
                 <w:i w:val="0"/>
                 <w:sz w:val="22"/>
               </w:rPr>
-              <w:t>Đăng nhập (theo vai trò)</w:t>
+              <w:t>Đăng nhập</w:t>
             </w:r>
           </w:p>
         </w:tc>
@@ -8575,7 +8574,7 @@
                 <w:i w:val="0"/>
                 <w:sz w:val="22"/>
               </w:rPr>
-              <w:t>Người dùng chọn tab vai trò (Admin / Giảng viên / Sinh viên) và đăng nhập bằng mã định danh + mật khẩu.</w:t>
+              <w:t>Người dùng đăng nhập bằng mã định danh + mật khẩu; hệ thống tự xác định vai trò (Admin / Giảng viên / Sinh viên) từ tài khoản.</w:t>
             </w:r>
           </w:p>
         </w:tc>
@@ -8847,7 +8846,7 @@
                 <w:i w:val="0"/>
                 <w:sz w:val="22"/>
               </w:rPr>
-              <w:t xml:space="preserve">1. Người dùng chọn tab vai trò trên màn hình đăng nhập, nhập mã định danh và mật khẩu. Giao diện kiểm tra định dạng mã theo vai trò đang chọn: Admin phải là </w:t>
+              <w:t>1. Người dùng nhập mã định danh (ví dụ admin, GV1001 hoặc 20216001) và mật khẩu trên màn hình đăng nhập. Giao diện kiểm tra hai trường không được để trống — bỏ trống thì thực hiện Luồng A.</w:t>
             </w:r>
             <w:r>
               <w:rPr>
@@ -8857,16 +8856,14 @@
                 <w:color w:val="404040"/>
                 <w:sz w:val="20"/>
               </w:rPr>
-              <w:t>admin</w:t>
-            </w:r>
-            <w:r>
-              <w:rPr>
-                <w:rFonts w:ascii="Times New Roman" w:hAnsi="Times New Roman" w:cs="Times New Roman"/>
-                <w:b w:val="0"/>
-                <w:i w:val="0"/>
-                <w:sz w:val="22"/>
-              </w:rPr>
-              <w:t xml:space="preserve">, Giảng viên dạng </w:t>
+            </w:r>
+            <w:r>
+              <w:rPr>
+                <w:rFonts w:ascii="Times New Roman" w:hAnsi="Times New Roman" w:cs="Times New Roman"/>
+                <w:b w:val="0"/>
+                <w:i w:val="0"/>
+                <w:sz w:val="22"/>
+              </w:rPr>
             </w:r>
             <w:r>
               <w:rPr>
@@ -8876,16 +8873,14 @@
                 <w:color w:val="404040"/>
                 <w:sz w:val="20"/>
               </w:rPr>
-              <w:t>GV</w:t>
-            </w:r>
-            <w:r>
-              <w:rPr>
-                <w:rFonts w:ascii="Times New Roman" w:hAnsi="Times New Roman" w:cs="Times New Roman"/>
-                <w:b w:val="0"/>
-                <w:i w:val="0"/>
-                <w:sz w:val="22"/>
-              </w:rPr>
-              <w:t xml:space="preserve"> kèm số (ví dụ GV1001), Sinh viên là dãy số (ví dụ 20216001) — sai định dạng thì thực hiện Luồng A.</w:t>
+            </w:r>
+            <w:r>
+              <w:rPr>
+                <w:rFonts w:ascii="Times New Roman" w:hAnsi="Times New Roman" w:cs="Times New Roman"/>
+                <w:b w:val="0"/>
+                <w:i w:val="0"/>
+                <w:sz w:val="22"/>
+              </w:rPr>
             </w:r>
           </w:p>
           <w:p>
@@ -8915,7 +8910,7 @@
                 <w:i w:val="0"/>
                 <w:sz w:val="22"/>
               </w:rPr>
-              <w:t>3. Hợp lệ: hệ thống xóa cặp khóa RSA cũ, sinh cặp khóa RSA-2048 mới, ký access token (15 phút) + refresh token (7 ngày), thiết lập 3 cookie và trả thông tin người dùng.</w:t>
+              <w:t>3. Hợp lệ: hệ thống xóa cặp khóa RSA cũ, sinh cặp khóa RSA-2048 mới, ký access token (15 phút) + refresh token (7 ngày), thiết lập 3 cookie và trả thông tin người dùng (kèm vai trò đọc từ CSDL).</w:t>
             </w:r>
           </w:p>
           <w:p>
@@ -8930,7 +8925,7 @@
                 <w:i w:val="0"/>
                 <w:sz w:val="22"/>
               </w:rPr>
-              <w:t>4. Giao diện lưu người dùng vào phiên làm việc và mở phân hệ tương ứng với vai trò.</w:t>
+              <w:t>4. Giao diện lưu người dùng vào phiên làm việc và tự mở phân hệ tương ứng với vai trò của tài khoản.</w:t>
             </w:r>
           </w:p>
         </w:tc>
@@ -8975,16 +8970,15 @@
                 <w:i w:val="0"/>
                 <w:sz w:val="22"/>
               </w:rPr>
-              <w:t xml:space="preserve">Luồng A — </w:t>
-            </w:r>
-            <w:r>
-              <w:rPr>
-                <w:rFonts w:ascii="Times New Roman" w:hAnsi="Times New Roman" w:cs="Times New Roman"/>
-                <w:b w:val="0"/>
-                <w:i w:val="0"/>
-                <w:sz w:val="22"/>
-              </w:rPr>
-              <w:t>Mã không khớp định dạng vai trò: hiển thị lỗi ngay tại ô nhập, không gửi yêu cầu lên server.</w:t>
+              <w:t>Luồng A — Bỏ trống mã định danh hoặc mật khẩu: hiển thị lỗi ngay tại giao diện, không gửi yêu cầu lên server.</w:t>
+            </w:r>
+            <w:r>
+              <w:rPr>
+                <w:rFonts w:ascii="Times New Roman" w:hAnsi="Times New Roman" w:cs="Times New Roman"/>
+                <w:b w:val="0"/>
+                <w:i w:val="0"/>
+                <w:sz w:val="22"/>
+              </w:rPr>
             </w:r>
           </w:p>
         </w:tc>
@@ -26383,7 +26377,7 @@
           <w:color w:val="444444"/>
           <w:sz w:val="22"/>
         </w:rPr>
-        <w:t>Hình 3.8. Sơ đồ tuần tự UC#01 — Đăng nhập theo vai trò</w:t>
+        <w:t>Hình 3.8. Sơ đồ tuần tự UC#01 — Đăng nhập</w:t>
       </w:r>
     </w:p>
     <w:p>
@@ -27665,7 +27659,7 @@
           <w:i w:val="0"/>
           <w:sz w:val="26"/>
         </w:rPr>
-        <w:t>Màn hình đăng nhập có ba tab vai trò (Admin / Giảng viên / Sinh viên). Người dùng nhập mã tài khoản đúng định dạng của vai trò đang chọn và mật khẩu; nhập sai định dạng sẽ bị nhắc ngay tại chỗ, không gửi yêu cầu lên server. Cùng màn hình này tích hợp trọn luồng quên mật khẩu: nhập mã tài khoản → nhận OTP qua email cá nhân → xác minh OTP → đặt mật khẩu mới với danh sách điều kiện hiển thị trực quan (đủ 8 ký tự, có chữ hoa, chữ số, ký tự đặc biệt).</w:t>
+        <w:t>Màn hình đăng nhập tối giản chỉ gồm hai trường: mã tài khoản và mật khẩu — người dùng không cần chọn vai trò, hệ thống tự xác định vai trò (Admin / Giảng viên / Sinh viên) từ tài khoản và mở đúng phân hệ tương ứng; bỏ trống trường nào sẽ bị nhắc ngay tại chỗ, không gửi yêu cầu lên server. Cùng màn hình này tích hợp trọn luồng quên mật khẩu: nhập mã tài khoản → nhận OTP qua email cá nhân → xác minh OTP → đặt mật khẩu mới với danh sách điều kiện hiển thị trực quan (đủ 8 ký tự, có chữ hoa, chữ số, ký tự đặc biệt).</w:t>
       </w:r>
     </w:p>
     <w:p>

</xml_diff>